<commit_message>
Adding the dynamic behaviour figure captions
</commit_message>
<xml_diff>
--- a/output/iala_aton_info_service_specification.docx
+++ b/output/iala_aton_info_service_specification.docx
@@ -1427,7 +1427,7 @@
         <w:pStyle w:val="1805"/>
       </w:pPr>
       <w:r>
-        <w:t xml:space="preserve">Marine Aids to Navigation (AtoN): Service Specification</w:t>
+        <w:t xml:space="preserve">Marine Aids to Navigation (AtoN) Service Specification</w:t>
       </w:r>
     </w:p>
     <w:p>
@@ -1467,7 +1467,7 @@
         <w:t xml:space="preserve"> </w:t>
       </w:r>
       <w:r>
-        <w:t xml:space="preserve">In the context of e-navigation there are a number of maritime services, and each of these make reference to a number of associated technical services. The technical services themselves are described on three levels;</w:t>
+        <w:t xml:space="preserve">In the context of e-navigation there is a number of maritime services, and each of these make reference to a number of associated technical services. The technical services themselves are described on three levels;</w:t>
       </w:r>
     </w:p>
     <w:p>
@@ -2025,7 +2025,7 @@
               <w:pStyle w:val="1842"/>
             </w:pPr>
             <w:r>
-              <w:t xml:space="preserve">MRN assigned by IHO (ex: urn:mrn:iho:technicalservice:specification:aton)</w:t>
+              <w:t xml:space="preserve">MRN assigned by IALA (ex: urn:mrn:iala:techsvc:ss:arm:atoninfo:1.0)</w:t>
             </w:r>
           </w:p>
         </w:tc>
@@ -2354,7 +2354,7 @@
         <w:t xml:space="preserve">AtoN Administrations will administer and publish local S-125 Data for their area of responsibility, typically this includes areas within that state’s exclusive economic zone. Where appropriate they should coordinate with adjacent or overlapping AtoN administrations who share responsibility within the same waterway. (e.g. Both the U.S. Coast Guard and Canadian Coast Guard maintain aids to navigation within the waterways comprising the Great Lakes.) The instance descriptions will provide detailed information of coverage area available to users.</w:t>
       </w:r>
     </w:p>
-    <w:bookmarkStart w:id="11" w:name="fig:potential_s125_service_exchanges"/>
+    <w:bookmarkStart w:id="11" w:name="fig:ms_aton_information_flow"/>
     <w:p xmlns:pic="http://schemas.openxmlformats.org/drawingml/2006/picture">
       <w:pPr>
         <w:pStyle w:val="1838"/>
@@ -2362,14 +2362,14 @@
       <w:r>
         <w:drawing>
           <wp:inline>
-            <wp:extent cx="6477000" cy="3095924"/>
+            <wp:extent cx="6477000" cy="3209165"/>
             <wp:effectExtent b="0" l="0" r="0" t="0"/>
-            <wp:docPr descr="Potential S-125 Service Exchanges." title="" id="3" name="Picture"/>
+            <wp:docPr descr="Example of the AtoN information flow, as per [2]." title="" id="3" name="Picture"/>
             <a:graphic>
               <a:graphicData uri="http://schemas.openxmlformats.org/drawingml/2006/picture">
                 <pic:pic>
                   <pic:nvPicPr>
-                    <pic:cNvPr descr="source/guideline/../../resources/PotentialS125ServiceExchanges.png" id="3" name="Picture"/>
+                    <pic:cNvPr descr="source/guideline/../../resources/AtoNInfoDistribution.png" id="3" name="Picture"/>
                     <pic:cNvPicPr>
                       <a:picLocks noChangeArrowheads="1" noChangeAspect="1"/>
                     </pic:cNvPicPr>
@@ -2383,7 +2383,7 @@
                   <pic:spPr bwMode="auto">
                     <a:xfrm>
                       <a:off x="0" y="0"/>
-                      <a:ext cx="6477000" cy="3095924"/>
+                      <a:ext cx="6477000" cy="3209165"/>
                     </a:xfrm>
                     <a:prstGeom prst="rect">
                       <a:avLst/>
@@ -2407,7 +2407,16 @@
         <w:pStyle w:val="1858"/>
       </w:pPr>
       <w:r>
-        <w:t xml:space="preserve">Potential S-125 Service Exchanges.</w:t>
+        <w:t xml:space="preserve">Example of the AtoN information flow, as per</w:t>
+      </w:r>
+      <w:r>
+        <w:t xml:space="preserve"> </w:t>
+      </w:r>
+      <w:r>
+        <w:t xml:space="preserve">[2]</w:t>
+      </w:r>
+      <w:r>
+        <w:t xml:space="preserve">.</w:t>
       </w:r>
     </w:p>
     <w:bookmarkEnd w:id="9"/>
@@ -2416,7 +2425,32 @@
         <w:pStyle w:val="1741"/>
       </w:pPr>
       <w:r>
-        <w:t xml:space="preserve">The service described in this specification defines the exchange of AtoN information between a service provider and the end user of such a service. In the most common case, the end user will use an ECDIS to receive and display the information onboard a ship. However, as depicted in Figure 3, the application of this service specification is not limited to the exchange of information from shore to ship. It may also be used to harmonise the exchange of AtoN information between other stakeholders in the data distribution chain before it is received by the end user on a ship. This includes the data exchange between AtoN Authorities, coastal authorities, Regional Electronic Navigational Chart Coordination Centre (RENCs), Value Added Providers, public portals, and other entities. Depending on the specific requirements, the service usage patterns may differ. For example, A Value-Added Provider could pull all available data and subscribe to updates from a data producer (e.g., national AtoN authority) and redistribute the data to the end user via its own implementation of this service (after applying validation checks or optimising the data for a specific group of end users). The orchestration of multiple AtoN information services in the distribution chain, however, is not in the scope of this document and lies within the responsibility of the service provider(s).</w:t>
+        <w:t xml:space="preserve">The service described in this specification defines the exchange of AtoN information between a service provider and the end user of such a service. In the most common case, the end user will use an ECDIS to receive and display the information onboard a ship. However, as illustrated in the IALA interperation of the IMO</w:t>
+      </w:r>
+      <w:r>
+        <w:t xml:space="preserve"> </w:t>
+      </w:r>
+      <w:r>
+        <w:rPr>
+          <w:i/>
+          <w:iCs/>
+        </w:rPr>
+        <w:t xml:space="preserve">MS-2 Aids to Navigation</w:t>
+      </w:r>
+      <w:r>
+        <w:t xml:space="preserve"> </w:t>
+      </w:r>
+      <w:r>
+        <w:t xml:space="preserve">maritime service</w:t>
+      </w:r>
+      <w:r>
+        <w:t xml:space="preserve"> </w:t>
+      </w:r>
+      <w:r>
+        <w:t xml:space="preserve">[2]</w:t>
+      </w:r>
+      <w:r>
+        <w:t xml:space="preserve">, seen in Figure 3, the application of this service specification is not limited to the exchange of information from shore to ship. It may also be used to harmonise the exchange of AtoN information between other stakeholders in the data distribution chain before it is received by the end user on a ship. This includes the data exchange between AtoN Authorities, coastal authorities, Regional Electronic Navigational Chart Coordination Centre (RENCs), Value Added Providers, public portals, and other entities. Depending on the specific requirements, the service usage patterns may differ. For example, A Value-Added Provider could pull all available data and subscribe to updates from a data producer (e.g., national AtoN authority) and redistribute the data to the end user via its own implementation of this service (after applying validation checks or optimising the data for a specific group of end users). The orchestration of multiple AtoN information services in the distribution chain, however, is not in the scope of this document and lies within the responsibility of the service provider(s).</w:t>
       </w:r>
     </w:p>
     <w:bookmarkStart w:id="12" w:name="sec:relationship_of_s124_to_s125"/>
@@ -2617,17 +2651,7 @@
         <w:t xml:space="preserve">[2]</w:t>
       </w:r>
       <w:r>
-        <w:t xml:space="preserve">. Please note that the feature identifiers referenced in Table </w:t>
-      </w:r>
-      <w:r>
-        <w:rPr>
-          <w:b/>
-          <w:bCs/>
-        </w:rPr>
-        <w:t xml:space="preserve">¿tbl:ms2-non-functional-requirement?</w:t>
-      </w:r>
-      <w:r>
-        <w:t xml:space="preserve">, are also refering to service features identified in the IALA MS-2 specification document.</w:t>
+        <w:t xml:space="preserve">. Please note that the feature identifiers referenced in Table 2, are also referring to service features identified in the IALA MS-2 specification document.</w:t>
       </w:r>
     </w:p>
     <w:bookmarkStart w:id="18" w:name="tbl:ms2-functional-requirements"/>
@@ -3286,128 +3310,6 @@
               <w:pStyle w:val="1842"/>
             </w:pPr>
             <w:r>
-              <w:t xml:space="preserve">MS2-FR010</w:t>
-            </w:r>
-          </w:p>
-        </w:tc>
-        <w:tc>
-          <w:tcPr/>
-          <w:p>
-            <w:pPr>
-              <w:pStyle w:val="1842"/>
-            </w:pPr>
-            <w:r>
-              <w:t xml:space="preserve">Discrepancy Reporting</w:t>
-            </w:r>
-          </w:p>
-        </w:tc>
-        <w:tc>
-          <w:tcPr/>
-          <w:p>
-            <w:pPr>
-              <w:pStyle w:val="1842"/>
-            </w:pPr>
-            <w:r>
-              <w:t xml:space="preserve">Provides a secure but open interface for reporting discrepancies. These reports should be authorized, and anonymous reporting should not be allowed.</w:t>
-            </w:r>
-          </w:p>
-        </w:tc>
-        <w:tc>
-          <w:tcPr/>
-          <w:p>
-            <w:pPr>
-              <w:pStyle w:val="1842"/>
-            </w:pPr>
-            <w:r>
-              <w:t xml:space="preserve">F007, F016, F017</w:t>
-            </w:r>
-          </w:p>
-        </w:tc>
-      </w:tr>
-      <w:tr>
-        <w:tc>
-          <w:tcPr/>
-          <w:p>
-            <w:pPr>
-              <w:pStyle w:val="1842"/>
-            </w:pPr>
-            <w:r>
-              <w:rPr>
-                <w:b/>
-                <w:bCs/>
-              </w:rPr>
-              <w:t xml:space="preserve">Functional</w:t>
-            </w:r>
-          </w:p>
-        </w:tc>
-        <w:tc>
-          <w:tcPr/>
-          <w:p>
-            <w:pPr>
-              <w:pStyle w:val="1842"/>
-            </w:pPr>
-            <w:r>
-              <w:t xml:space="preserve">MS2-FR011</w:t>
-            </w:r>
-          </w:p>
-        </w:tc>
-        <w:tc>
-          <w:tcPr/>
-          <w:p>
-            <w:pPr>
-              <w:pStyle w:val="1842"/>
-            </w:pPr>
-            <w:r>
-              <w:t xml:space="preserve">Discrepancy Flagging</w:t>
-            </w:r>
-          </w:p>
-        </w:tc>
-        <w:tc>
-          <w:tcPr/>
-          <w:p>
-            <w:pPr>
-              <w:pStyle w:val="1842"/>
-            </w:pPr>
-            <w:r>
-              <w:t xml:space="preserve">Multiple AtoN service discrepancies are flagged to system administrators as soon as they are reported, so that they can be actioned.</w:t>
-            </w:r>
-          </w:p>
-        </w:tc>
-        <w:tc>
-          <w:tcPr/>
-          <w:p>
-            <w:pPr>
-              <w:pStyle w:val="1842"/>
-            </w:pPr>
-            <w:r>
-              <w:t xml:space="preserve">F007, F016, F017</w:t>
-            </w:r>
-          </w:p>
-        </w:tc>
-      </w:tr>
-      <w:tr>
-        <w:tc>
-          <w:tcPr/>
-          <w:p>
-            <w:pPr>
-              <w:pStyle w:val="1842"/>
-            </w:pPr>
-            <w:r>
-              <w:rPr>
-                <w:b/>
-                <w:bCs/>
-              </w:rPr>
-              <w:t xml:space="preserve">Functional</w:t>
-            </w:r>
-          </w:p>
-        </w:tc>
-        <w:tc>
-          <w:tcPr/>
-          <w:p>
-            <w:pPr>
-              <w:pStyle w:val="1842"/>
-            </w:pPr>
-            <w:r>
               <w:t xml:space="preserve">MS2-FR012</w:t>
             </w:r>
           </w:p>
@@ -3880,7 +3782,7 @@
         <w:pStyle w:val="1741"/>
       </w:pPr>
       <w:r>
-        <w:t xml:space="preserve">The table below defines non-functional requirements for the S-125 service, as there are defined in the IALA documentation for the IMO MS-2 Aids to Navigation Maritime Service</w:t>
+        <w:t xml:space="preserve">The table below defines non-functional requirements for the S-125 service, as these are defined in the IALA documentation for the IMO MS-2 Aids to Navigation Maritime Service</w:t>
       </w:r>
       <w:r>
         <w:t xml:space="preserve"> </w:t>
@@ -3889,17 +3791,7 @@
         <w:t xml:space="preserve">[2]</w:t>
       </w:r>
       <w:r>
-        <w:t xml:space="preserve">. Please note that the feature identifiers referenced in Table </w:t>
-      </w:r>
-      <w:r>
-        <w:rPr>
-          <w:b/>
-          <w:bCs/>
-        </w:rPr>
-        <w:t xml:space="preserve">¿tbl:ms2-non-functional-requirement?</w:t>
-      </w:r>
-      <w:r>
-        <w:t xml:space="preserve">, are also refering to service features identified in the IALA MS-2 specification document.</w:t>
+        <w:t xml:space="preserve">. Please note that the feature identifiers referenced in Table 3, are also referring to service features identified in the IALA MS-2 specification document.</w:t>
       </w:r>
     </w:p>
     <w:bookmarkStart w:id="19" w:name="tbl:ms2-non-functional-requirements"/>
@@ -6522,22 +6414,7 @@
         <w:t xml:space="preserve"> </w:t>
       </w:r>
       <w:r>
-        <w:t xml:space="preserve">which is optional. The specific encodings are left to be decided by the service technical design specification. In most cases the parameter description provides an adequate definition. The</w:t>
-      </w:r>
-      <w:r>
-        <w:t xml:space="preserve"> </w:t>
-      </w:r>
-      <w:r>
-        <w:rPr>
-          <w:rStyle w:val="1876"/>
-        </w:rPr>
-        <w:t xml:space="preserve">&lt;AreaName&gt;</w:t>
-      </w:r>
-      <w:r>
-        <w:t xml:space="preserve"> </w:t>
-      </w:r>
-      <w:r>
-        <w:t xml:space="preserve">parameter however is intentionally left more abstract, so that a more generic server-side area naming convention can be utilised (e.g. nationally defined waterways). It is envisaged that area name identifiers based on the IHO S-130 data product could be used in the future.</w:t>
+        <w:t xml:space="preserve">which is optional. The specific encodings are left to be decided by the service technical design specification. In most cases the parameter description provides an adequate definition.</w:t>
       </w:r>
     </w:p>
     <w:bookmarkEnd w:id="34"/>
@@ -6722,7 +6599,7 @@
               <w:pStyle w:val="1842"/>
             </w:pPr>
             <w:r>
-              <w:t xml:space="preserve">AreaName</w:t>
+              <w:t xml:space="preserve">unlocode</w:t>
             </w:r>
           </w:p>
         </w:tc>
@@ -6755,7 +6632,7 @@
               <w:pStyle w:val="1842"/>
             </w:pPr>
             <w:r>
-              <w:t xml:space="preserve">Name or identifier of a pre-defined area or waterway (e.g. “German Bight”).</w:t>
+              <w:t xml:space="preserve">UN/LOCODE (United Nations Code for Trade and Transport Locations) of a defined object (e.g., “CN” for China).</w:t>
             </w:r>
           </w:p>
         </w:tc>
@@ -6806,52 +6683,6 @@
           </w:p>
         </w:tc>
       </w:tr>
-      <w:tr>
-        <w:tc>
-          <w:tcPr/>
-          <w:p>
-            <w:pPr>
-              <w:pStyle w:val="1842"/>
-            </w:pPr>
-            <w:r>
-              <w:t xml:space="preserve">AtoNIdentifier</w:t>
-            </w:r>
-          </w:p>
-        </w:tc>
-        <w:tc>
-          <w:tcPr/>
-          <w:p>
-            <w:pPr>
-              <w:pStyle w:val="1842"/>
-            </w:pPr>
-            <w:r>
-              <w:t xml:space="preserve">MRN</w:t>
-            </w:r>
-          </w:p>
-        </w:tc>
-        <w:tc>
-          <w:tcPr/>
-          <w:p>
-            <w:pPr>
-              <w:pStyle w:val="1842"/>
-            </w:pPr>
-            <w:r>
-              <w:t xml:space="preserve">0..1</w:t>
-            </w:r>
-          </w:p>
-        </w:tc>
-        <w:tc>
-          <w:tcPr/>
-          <w:p>
-            <w:pPr>
-              <w:pStyle w:val="1842"/>
-            </w:pPr>
-            <w:r>
-              <w:t xml:space="preserve">An AtoN MRN can be provided to query information related to the geographical location of a specific AtoN.</w:t>
-            </w:r>
-          </w:p>
-        </w:tc>
-      </w:tr>
     </w:tbl>
     <w:bookmarkEnd w:id="35"/>
     <w:bookmarkEnd w:id="36"/>
@@ -7007,22 +6838,7 @@
         <w:t xml:space="preserve"> </w:t>
       </w:r>
       <w:r>
-        <w:t xml:space="preserve">which is optional. The specific encodings are left to be decided by the respective service technical design specification. In most cases the parameter description provides an adequate definition. The</w:t>
-      </w:r>
-      <w:r>
-        <w:t xml:space="preserve"> </w:t>
-      </w:r>
-      <w:r>
-        <w:rPr>
-          <w:rStyle w:val="1876"/>
-        </w:rPr>
-        <w:t xml:space="preserve">&lt;AreaName&gt;</w:t>
-      </w:r>
-      <w:r>
-        <w:t xml:space="preserve"> </w:t>
-      </w:r>
-      <w:r>
-        <w:t xml:space="preserve">parameter however is again intentionally left more abstract, so that a more generic server-side area naming convention can be utilised (e.g. nationally defined waterways). It is envisaged that area name identifiers based on the IHO S-130 data product could be used in the future.</w:t>
+        <w:t xml:space="preserve">which is optional. The specific encodings are left to be decided by the respective service technical design specification. In most cases the parameter description provides an adequate definition.</w:t>
       </w:r>
     </w:p>
     <w:bookmarkEnd w:id="39"/>
@@ -7207,7 +7023,7 @@
               <w:pStyle w:val="1842"/>
             </w:pPr>
             <w:r>
-              <w:t xml:space="preserve">AreaName</w:t>
+              <w:t xml:space="preserve">unlocode</w:t>
             </w:r>
           </w:p>
         </w:tc>
@@ -7240,7 +7056,7 @@
               <w:pStyle w:val="1842"/>
             </w:pPr>
             <w:r>
-              <w:t xml:space="preserve">Name or identifier of a pre-defined area or waterway (e.g. “German Bight”).</w:t>
+              <w:t xml:space="preserve">UN/LOCODE (United Nations Code for Trade and Transport Locations) of a defined object (e.g., “CN” for China).</w:t>
             </w:r>
           </w:p>
         </w:tc>
@@ -7287,52 +7103,6 @@
             </w:pPr>
             <w:r>
               <w:t xml:space="preserve">An optional parameter denoting the time period (ValidFrom, ValidTo) in which a dataset is valid and becomes subject to changes. The service response should only include the S-125 datasets for which modifications occurred within the specified interval.</w:t>
-            </w:r>
-          </w:p>
-        </w:tc>
-      </w:tr>
-      <w:tr>
-        <w:tc>
-          <w:tcPr/>
-          <w:p>
-            <w:pPr>
-              <w:pStyle w:val="1842"/>
-            </w:pPr>
-            <w:r>
-              <w:t xml:space="preserve">AtoNIdentifier</w:t>
-            </w:r>
-          </w:p>
-        </w:tc>
-        <w:tc>
-          <w:tcPr/>
-          <w:p>
-            <w:pPr>
-              <w:pStyle w:val="1842"/>
-            </w:pPr>
-            <w:r>
-              <w:t xml:space="preserve">MRN</w:t>
-            </w:r>
-          </w:p>
-        </w:tc>
-        <w:tc>
-          <w:tcPr/>
-          <w:p>
-            <w:pPr>
-              <w:pStyle w:val="1842"/>
-            </w:pPr>
-            <w:r>
-              <w:t xml:space="preserve">0..1</w:t>
-            </w:r>
-          </w:p>
-        </w:tc>
-        <w:tc>
-          <w:tcPr/>
-          <w:p>
-            <w:pPr>
-              <w:pStyle w:val="1842"/>
-            </w:pPr>
-            <w:r>
-              <w:t xml:space="preserve">An MRN can be provided to query information related to a specific AtoN.</w:t>
             </w:r>
           </w:p>
         </w:tc>
@@ -7623,22 +7393,7 @@
         <w:pStyle w:val="1741"/>
       </w:pPr>
       <w:r>
-        <w:t xml:space="preserve">All instances of services providing AtoN information are required to support all operation parameters presented in the following sub-section Section 4.2.3.2, although the specific encodings are left to be decided by the service technical design specification. In most cases the parameter description provides an adequate definition. The</w:t>
-      </w:r>
-      <w:r>
-        <w:t xml:space="preserve"> </w:t>
-      </w:r>
-      <w:r>
-        <w:rPr>
-          <w:rStyle w:val="1876"/>
-        </w:rPr>
-        <w:t xml:space="preserve">&lt;AreaName&gt;</w:t>
-      </w:r>
-      <w:r>
-        <w:t xml:space="preserve"> </w:t>
-      </w:r>
-      <w:r>
-        <w:t xml:space="preserve">parameter however is again intentionally left more abstract, so that a more generic server-side area naming convention can be utilised (e.g. nationally defined waterways). It is envisaged that area name identifiers based on the IHO S-130 data product could be used in the future.</w:t>
+        <w:t xml:space="preserve">All instances of services providing AtoN information are required to support all operation parameters presented in the following sub-section Section 4.2.3.2, although the specific encodings are left to be decided by the service technical design specification. In most cases the parameter description provides an adequate definition.</w:t>
       </w:r>
     </w:p>
     <w:bookmarkEnd w:id="45"/>
@@ -7823,7 +7578,7 @@
               <w:pStyle w:val="1842"/>
             </w:pPr>
             <w:r>
-              <w:t xml:space="preserve">AreaName</w:t>
+              <w:t xml:space="preserve">unlocode</w:t>
             </w:r>
           </w:p>
         </w:tc>
@@ -7856,7 +7611,7 @@
               <w:pStyle w:val="1842"/>
             </w:pPr>
             <w:r>
-              <w:t xml:space="preserve">Name or identifier of a pre-defined area or waterway (e.g. “German Bight”).</w:t>
+              <w:t xml:space="preserve">UN/LOCODE (United Nations Code for Trade and Transport Locations) of a defined object (e.g., “CN” for China).</w:t>
             </w:r>
           </w:p>
         </w:tc>
@@ -7903,52 +7658,6 @@
             </w:pPr>
             <w:r>
               <w:t xml:space="preserve">The period for which the subscription is active (start and end date/time).</w:t>
-            </w:r>
-          </w:p>
-        </w:tc>
-      </w:tr>
-      <w:tr>
-        <w:tc>
-          <w:tcPr/>
-          <w:p>
-            <w:pPr>
-              <w:pStyle w:val="1842"/>
-            </w:pPr>
-            <w:r>
-              <w:t xml:space="preserve">AtoNIdentifier</w:t>
-            </w:r>
-          </w:p>
-        </w:tc>
-        <w:tc>
-          <w:tcPr/>
-          <w:p>
-            <w:pPr>
-              <w:pStyle w:val="1842"/>
-            </w:pPr>
-            <w:r>
-              <w:t xml:space="preserve">MRN</w:t>
-            </w:r>
-          </w:p>
-        </w:tc>
-        <w:tc>
-          <w:tcPr/>
-          <w:p>
-            <w:pPr>
-              <w:pStyle w:val="1842"/>
-            </w:pPr>
-            <w:r>
-              <w:t xml:space="preserve">0..1</w:t>
-            </w:r>
-          </w:p>
-        </w:tc>
-        <w:tc>
-          <w:tcPr/>
-          <w:p>
-            <w:pPr>
-              <w:pStyle w:val="1842"/>
-            </w:pPr>
-            <w:r>
-              <w:t xml:space="preserve">An MRN can be provided to query information related to a specific AtoN.</w:t>
             </w:r>
           </w:p>
         </w:tc>
@@ -9710,14 +9419,14 @@
       <w:r>
         <w:drawing>
           <wp:inline>
-            <wp:extent cx="6477000" cy="1541183"/>
+            <wp:extent cx="6477000" cy="2829652"/>
             <wp:effectExtent b="0" l="0" r="0" t="0"/>
             <wp:docPr descr="Client-Initiated AtoN Information Retrieval through the Get operation." title="" id="12" name="Picture"/>
             <a:graphic>
               <a:graphicData uri="http://schemas.openxmlformats.org/drawingml/2006/picture">
                 <pic:pic>
                   <pic:nvPicPr>
-                    <pic:cNvPr descr="source/guideline/../../resources/DynamicBehaviour-Get.drawio.png" id="12" name="Picture"/>
+                    <pic:cNvPr descr="source/guideline/./dynamic_behaviour-1.png" id="12" name="Picture"/>
                     <pic:cNvPicPr>
                       <a:picLocks noChangeArrowheads="1" noChangeAspect="1"/>
                     </pic:cNvPicPr>
@@ -9731,7 +9440,7 @@
                   <pic:spPr bwMode="auto">
                     <a:xfrm>
                       <a:off x="0" y="0"/>
-                      <a:ext cx="6477000" cy="1541183"/>
+                      <a:ext cx="6477000" cy="2829652"/>
                     </a:xfrm>
                     <a:prstGeom prst="rect">
                       <a:avLst/>
@@ -9764,7 +9473,7 @@
         <w:pStyle w:val="1741"/>
       </w:pPr>
       <w:r>
-        <w:t xml:space="preserve">In cases where the service consumer requires more information, before making a decision on which datasets should be downloaded, the latter “Client-initiated AtoN Information Retrieval” method can be utilised, by contacting the Get Summary operation beforehand. This is demonstrated in Figure 12, where the service consumer requests the list of the available S-125 dataset metadata via the summary operation and directly receives a response from the service provider. The service consumer can then select a dataset reference identifier from the returned list and request the detailed information (i.e. the complete S-125 dataset) back, through the Get operation of the service provider. The corresponding S-125 dataset (and/or its corresponding updates) will be packaged as an S-100 Exchange Set and then get sent back to the service consumer as direct response.</w:t>
+        <w:t xml:space="preserve">In cases where the service consumer requires more information, before making a decision on which datasets should be downloaded, the latter “Client-initiated AtoN Information Retrieval” method can be utilised, by contacting the Get Summary operation beforehand. This is demonstrated in Figure 13, where the service consumer requests the list of the available S-125 dataset metadata via the summary operation and directly receives a response from the service provider. The service consumer can then select a dataset reference identifier from the returned list and request the detailed information (i.e. the complete S-125 dataset) back, through the Get operation of the service provider. The corresponding S-125 dataset (and/or its corresponding updates) will be packaged as an S-100 Exchange Set and then get sent back to the service consumer as direct response.</w:t>
       </w:r>
     </w:p>
     <w:bookmarkStart w:id="76" w:name="Xa799260ab5ee587eb408857f814c1960d725c5c"/>
@@ -9775,14 +9484,14 @@
       <w:r>
         <w:drawing>
           <wp:inline>
-            <wp:extent cx="6477000" cy="2749954"/>
+            <wp:extent cx="6477000" cy="3436973"/>
             <wp:effectExtent b="0" l="0" r="0" t="0"/>
             <wp:docPr descr="Client-Initiated AtoN Information Retrieval through the Get Summary operation." title="" id="13" name="Picture"/>
             <a:graphic>
               <a:graphicData uri="http://schemas.openxmlformats.org/drawingml/2006/picture">
                 <pic:pic>
                   <pic:nvPicPr>
-                    <pic:cNvPr descr="source/guideline/../../resources/DynamicBehaviour-GetSummary.drawio.png" id="13" name="Picture"/>
+                    <pic:cNvPr descr="source/guideline/./dynamic_behaviour-2.png" id="13" name="Picture"/>
                     <pic:cNvPicPr>
                       <a:picLocks noChangeArrowheads="1" noChangeAspect="1"/>
                     </pic:cNvPicPr>
@@ -9796,7 +9505,7 @@
                   <pic:spPr bwMode="auto">
                     <a:xfrm>
                       <a:off x="0" y="0"/>
-                      <a:ext cx="6477000" cy="2749954"/>
+                      <a:ext cx="6477000" cy="3436973"/>
                     </a:xfrm>
                     <a:prstGeom prst="rect">
                       <a:avLst/>
@@ -9829,7 +9538,7 @@
         <w:pStyle w:val="1741"/>
       </w:pPr>
       <w:r>
-        <w:t xml:space="preserve">As demonstrated in Figure 12, the Get Summary operation accepts similar operation parameters as the Get operation, which can be employed to filter the summary response list. This feature improves the flexibility of the whole operation as for example, even if a provided geometry operation parameter matches more than one S-125 datasets, only the required dataset will eventually be retrieved by the service consumer, by using its respective dataset reference identifier.</w:t>
+        <w:t xml:space="preserve">As demonstrated in Figure 13, the Get Summary operation accepts similar operation parameters as the Get operation, which can be employed to filter the summary response list. This feature improves the flexibility of the whole operation as for example, even if a provided geometry operation parameter matches more than one S-125 datasets, only the required dataset will eventually be retrieved by the service consumer, by using its respective dataset reference identifier.</w:t>
       </w:r>
     </w:p>
     <w:bookmarkEnd w:id="76"/>
@@ -9870,7 +9579,7 @@
         <w:pStyle w:val="1741"/>
       </w:pPr>
       <w:r>
-        <w:t xml:space="preserve">Figure 13 illustrates the typical behaviour the subscription operation. Initially, the service consumer is required to initiate the subscription through the Subscription operation of the service provider. By utilising the available operation parameters such as the geometry, the area name and the subscription period, only the specific S-125 datasets matching the specified criteria and have updates during the specified subscription interval will be covered. Once the subscription request has been received, processed and accepted by the service provider, a notification should be sent back to the service consumer, using its Subscription Notification operation. This notification will indicate that the requested subscription has commenced and should include the identifier reference of the established subscription.</w:t>
+        <w:t xml:space="preserve">Figure 14 illustrates the typical behaviour the subscription operation. Initially, the service consumer is required to initiate the subscription through the Subscription operation of the service provider. By utilising the available operation parameters such as the geometry, the area name and the subscription period, only the specific S-125 datasets matching the specified criteria and have updates during the specified subscription interval will be covered. Once the subscription request has been received, processed and accepted by the service provider, a notification should be sent back to the service consumer, using its Subscription Notification operation. This notification will indicate that the requested subscription has commenced and should include the identifier reference of the established subscription.</w:t>
       </w:r>
     </w:p>
     <w:p>
@@ -9878,7 +9587,15 @@
         <w:pStyle w:val="1741"/>
       </w:pPr>
       <w:r>
-        <w:t xml:space="preserve">Whenever an update is made available on the set of S-125 datasets covered by a subscription, the service consumer Upload operation is used to deliver these updates, packaged as S-100 Exchange Sets, to the service consumer. Depending on the implementation of the service, the consumer may be required to respond to this operation by sending an acknowledgement message back to the service provider. The subscription updates will continue to be provided until</w:t>
+        <w:t xml:space="preserve">Whenever an update is made available on the set of S-125 datasets covered by a subscription, the service consumer Upload operation is used to deliver these updates, packaged as S-100 Exchange Sets, to the service consumer. Depending on the implementation of the service, the consumer may be required to respond to this operation by sending an acknowledgement message back to the service provider. This is an optional operation, depending on the implementing technology. Therefore, it is not covered as an operation in this service specification.</w:t>
+      </w:r>
+    </w:p>
+    <w:p>
+      <w:pPr>
+        <w:pStyle w:val="1741"/>
+      </w:pPr>
+      <w:r>
+        <w:t xml:space="preserve">The subscription updates will continue to be provided until</w:t>
       </w:r>
       <w:r>
         <w:t xml:space="preserve"> </w:t>
@@ -9953,14 +9670,14 @@
       <w:r>
         <w:drawing>
           <wp:inline>
-            <wp:extent cx="6477000" cy="3757264"/>
+            <wp:extent cx="6477000" cy="4592449"/>
             <wp:effectExtent b="0" l="0" r="0" t="0"/>
             <wp:docPr descr="Subscription requested by external service." title="" id="14" name="Picture"/>
             <a:graphic>
               <a:graphicData uri="http://schemas.openxmlformats.org/drawingml/2006/picture">
                 <pic:pic>
                   <pic:nvPicPr>
-                    <pic:cNvPr descr="source/guideline/../../resources/DynamicBehaviour-Subscription.drawio.png" id="14" name="Picture"/>
+                    <pic:cNvPr descr="source/guideline/./dynamic_behaviour-3.png" id="14" name="Picture"/>
                     <pic:cNvPicPr>
                       <a:picLocks noChangeArrowheads="1" noChangeAspect="1"/>
                     </pic:cNvPicPr>
@@ -9974,7 +9691,7 @@
                   <pic:spPr bwMode="auto">
                     <a:xfrm>
                       <a:off x="0" y="0"/>
-                      <a:ext cx="6477000" cy="3757264"/>
+                      <a:ext cx="6477000" cy="4592449"/>
                     </a:xfrm>
                     <a:prstGeom prst="rect">
                       <a:avLst/>
@@ -19480,7 +19197,7 @@
     </w:lvl>
   </w:abstractNum>
   <w:abstractNum w:abstractNumId="25">
-    <w:nsid w:val="035871BD"/>
+    <w:nsid w:val="015804D7"/>
     <w:multiLevelType w:val="multilevel"/>
     <w:lvl w:ilvl="0">
       <w:numFmt w:val="bullet"/>
@@ -19583,7 +19300,7 @@
     </w:lvl>
   </w:abstractNum>
   <w:abstractNum w:abstractNumId="26">
-    <w:nsid w:val="04768D56"/>
+    <w:nsid w:val="01647496"/>
     <w:multiLevelType w:val="multilevel"/>
     <w:lvl w:ilvl="0">
       <w:start w:val="1"/>

</xml_diff>